<commit_message>
feat: add automatic Research Memories Gallery tab with GitHub sync and interactive lightbox
</commit_message>
<xml_diff>
--- a/Portfolio_Instruction_Manual.docx
+++ b/Portfolio_Instruction_Manual.docx
@@ -5,29 +5,29 @@
     <w:p>
       <w:pPr>
         <w:spacing w:before="0" w:after="80"/>
+        <w:jc w:val="center"/>
       </w:pPr>
       <w:r>
         <w:rPr>
-          <w:rFonts w:ascii="Calibri" w:hAnsi="Calibri"/>
           <w:b/>
           <w:color w:val="059669"/>
-          <w:sz w:val="48"/>
+          <w:sz w:val="44"/>
         </w:rPr>
-        <w:t>Portfolio Website Management Protocol</w:t>
+        <w:t>PANKAJ SHARMA | RESEARCH PORTFOLIO</w:t>
       </w:r>
     </w:p>
     <w:p>
       <w:pPr>
-        <w:spacing w:before="0" w:after="280"/>
+        <w:spacing w:before="0" w:after="360"/>
+        <w:jc w:val="center"/>
       </w:pPr>
       <w:r>
         <w:rPr>
-          <w:rFonts w:ascii="Calibri" w:hAnsi="Calibri"/>
           <w:i/>
-          <w:color w:val="475569"/>
+          <w:color w:val="64748B"/>
           <w:sz w:val="26"/>
         </w:rPr>
-        <w:t>Official Protocol for Adding, Editing, and Removing Portfolio Content</w:t>
+        <w:t>Master User Manual &amp; Protocol: Adding/Removing Content &amp; Automatic GitHub Gallery</w:t>
       </w:r>
     </w:p>
     <w:tbl>
@@ -37,209 +37,37 @@
         <w:tblLook w:firstColumn="1" w:firstRow="1" w:lastColumn="0" w:lastRow="0" w:noHBand="0" w:noVBand="1" w:val="04A0"/>
       </w:tblPr>
       <w:tblGrid>
-        <w:gridCol w:w="4680"/>
-        <w:gridCol w:w="4680"/>
+        <w:gridCol w:w="9936"/>
       </w:tblGrid>
       <w:tr>
         <w:tc>
           <w:tcPr>
-            <w:tcW w:type="dxa" w:w="4680"/>
-            <w:shd w:fill="F8FAFC"/>
-            <w:tcMar>
-              <w:top w:w="60" w:type="dxa"/>
-              <w:bottom w:w="60" w:type="dxa"/>
-              <w:left w:w="100" w:type="dxa"/>
-              <w:right w:w="100" w:type="dxa"/>
-            </w:tcMar>
+            <w:tcW w:type="dxa" w:w="9792"/>
+            <w:shd w:fill="F0FDF4"/>
+            <w:tcBorders>
+              <w:left w:val="single" w:sz="24" w:space="0" w:color="059669"/>
+              <w:top w:val="none"/>
+              <w:right w:val="none"/>
+              <w:bottom w:val="none"/>
+            </w:tcBorders>
           </w:tcPr>
           <w:p>
             <w:pPr>
-              <w:spacing w:after="0"/>
+              <w:spacing w:before="120" w:after="120"/>
             </w:pPr>
             <w:r>
               <w:rPr>
                 <w:b/>
-                <w:color w:val="0F172A"/>
+                <w:color w:val="059669"/>
                 <w:sz w:val="20"/>
               </w:rPr>
-              <w:t>Researcher / Owner:</w:t>
-            </w:r>
-          </w:p>
-        </w:tc>
-        <w:tc>
-          <w:tcPr>
-            <w:tcW w:type="dxa" w:w="4680"/>
-            <w:shd w:fill="FFFFFF"/>
-            <w:tcMar>
-              <w:top w:w="60" w:type="dxa"/>
-              <w:bottom w:w="60" w:type="dxa"/>
-              <w:left w:w="100" w:type="dxa"/>
-              <w:right w:w="100" w:type="dxa"/>
-            </w:tcMar>
-          </w:tcPr>
-          <w:p>
-            <w:pPr>
-              <w:spacing w:after="0"/>
-            </w:pPr>
-            <w:r>
-              <w:rPr>
-                <w:color w:val="1E293B"/>
-                <w:sz w:val="20"/>
-              </w:rPr>
-              <w:t>Pankaj Sharma (Research Chemist &amp; Applied Nanochemist)</w:t>
-            </w:r>
-          </w:p>
-        </w:tc>
-      </w:tr>
-      <w:tr>
-        <w:tc>
-          <w:tcPr>
-            <w:tcW w:type="dxa" w:w="4680"/>
-            <w:shd w:fill="F8FAFC"/>
-            <w:tcMar>
-              <w:top w:w="60" w:type="dxa"/>
-              <w:bottom w:w="60" w:type="dxa"/>
-              <w:left w:w="100" w:type="dxa"/>
-              <w:right w:w="100" w:type="dxa"/>
-            </w:tcMar>
-          </w:tcPr>
-          <w:p>
-            <w:pPr>
-              <w:spacing w:after="0"/>
-            </w:pPr>
-            <w:r>
-              <w:rPr>
-                <w:b/>
-                <w:color w:val="0F172A"/>
-                <w:sz w:val="20"/>
-              </w:rPr>
-              <w:t>Live Website:</w:t>
-            </w:r>
-          </w:p>
-        </w:tc>
-        <w:tc>
-          <w:tcPr>
-            <w:tcW w:type="dxa" w:w="4680"/>
-            <w:shd w:fill="FFFFFF"/>
-            <w:tcMar>
-              <w:top w:w="60" w:type="dxa"/>
-              <w:bottom w:w="60" w:type="dxa"/>
-              <w:left w:w="100" w:type="dxa"/>
-              <w:right w:w="100" w:type="dxa"/>
-            </w:tcMar>
-          </w:tcPr>
-          <w:p>
-            <w:pPr>
-              <w:spacing w:after="0"/>
-            </w:pPr>
-            <w:r>
-              <w:rPr>
-                <w:color w:val="1E293B"/>
-                <w:sz w:val="20"/>
-              </w:rPr>
-              <w:t>https://punitsharma16042003.github.io/Myportfolio/</w:t>
-            </w:r>
-          </w:p>
-        </w:tc>
-      </w:tr>
-      <w:tr>
-        <w:tc>
-          <w:tcPr>
-            <w:tcW w:type="dxa" w:w="4680"/>
-            <w:shd w:fill="F8FAFC"/>
-            <w:tcMar>
-              <w:top w:w="60" w:type="dxa"/>
-              <w:bottom w:w="60" w:type="dxa"/>
-              <w:left w:w="100" w:type="dxa"/>
-              <w:right w:w="100" w:type="dxa"/>
-            </w:tcMar>
-          </w:tcPr>
-          <w:p>
-            <w:pPr>
-              <w:spacing w:after="0"/>
-            </w:pPr>
-            <w:r>
-              <w:rPr>
-                <w:b/>
-                <w:color w:val="0F172A"/>
-                <w:sz w:val="20"/>
-              </w:rPr>
-              <w:t>GitHub Repository:</w:t>
-            </w:r>
-          </w:p>
-        </w:tc>
-        <w:tc>
-          <w:tcPr>
-            <w:tcW w:type="dxa" w:w="4680"/>
-            <w:shd w:fill="FFFFFF"/>
-            <w:tcMar>
-              <w:top w:w="60" w:type="dxa"/>
-              <w:bottom w:w="60" w:type="dxa"/>
-              <w:left w:w="100" w:type="dxa"/>
-              <w:right w:w="100" w:type="dxa"/>
-            </w:tcMar>
-          </w:tcPr>
-          <w:p>
-            <w:pPr>
-              <w:spacing w:after="0"/>
-            </w:pPr>
-            <w:r>
-              <w:rPr>
-                <w:color w:val="1E293B"/>
-                <w:sz w:val="20"/>
-              </w:rPr>
-              <w:t>https://github.com/punitsharma16042003/Myportfolio</w:t>
-            </w:r>
-          </w:p>
-        </w:tc>
-      </w:tr>
-      <w:tr>
-        <w:tc>
-          <w:tcPr>
-            <w:tcW w:type="dxa" w:w="4680"/>
-            <w:shd w:fill="F8FAFC"/>
-            <w:tcMar>
-              <w:top w:w="60" w:type="dxa"/>
-              <w:bottom w:w="60" w:type="dxa"/>
-              <w:left w:w="100" w:type="dxa"/>
-              <w:right w:w="100" w:type="dxa"/>
-            </w:tcMar>
-          </w:tcPr>
-          <w:p>
-            <w:pPr>
-              <w:spacing w:after="0"/>
-            </w:pPr>
-            <w:r>
-              <w:rPr>
-                <w:b/>
-                <w:color w:val="0F172A"/>
-                <w:sz w:val="20"/>
-              </w:rPr>
-              <w:t>Master Config File:</w:t>
-            </w:r>
-          </w:p>
-        </w:tc>
-        <w:tc>
-          <w:tcPr>
-            <w:tcW w:type="dxa" w:w="4680"/>
-            <w:shd w:fill="FFFFFF"/>
-            <w:tcMar>
-              <w:top w:w="60" w:type="dxa"/>
-              <w:bottom w:w="60" w:type="dxa"/>
-              <w:left w:w="100" w:type="dxa"/>
-              <w:right w:w="100" w:type="dxa"/>
-            </w:tcMar>
-          </w:tcPr>
-          <w:p>
-            <w:pPr>
-              <w:spacing w:after="0"/>
-            </w:pPr>
-            <w:r>
-              <w:rPr>
-                <w:color w:val="1E293B"/>
-                <w:sz w:val="20"/>
-              </w:rPr>
-              <w:t>portfolio-data.js (in your project folder)</w:t>
+              <w:t>🌐 Live Website: https://punitsharma16042003.github.io/Myportfolio/</w:t>
+              <w:br/>
+              <w:t>📁 GitHub Repository: https://github.com/punitsharma16042003/Myportfolio</w:t>
+              <w:br/>
+              <w:t>✨ Master Data File: portfolio-data.js (Zero HTML/CSS editing needed)</w:t>
+              <w:br/>
+              <w:t>📸 Automatic Photos Folder: gallery/ (Drop photos on GitHub to display instantly!)</w:t>
             </w:r>
           </w:p>
         </w:tc>
@@ -252,20 +80,222 @@
     </w:p>
     <w:p>
       <w:pPr>
+        <w:keepNext/>
         <w:spacing w:before="320" w:after="120"/>
       </w:pPr>
       <w:r>
         <w:rPr>
           <w:b/>
-          <w:color w:val="0F172A"/>
-          <w:sz w:val="32"/>
+          <w:color w:val="059669"/>
+          <w:sz w:val="30"/>
         </w:rPr>
-        <w:t>1. System Architecture &amp; Core Concept</w:t>
+        <w:t>1. Overview &amp; Architecture</w:t>
       </w:r>
     </w:p>
     <w:p>
       <w:r>
-        <w:t>Your portfolio website is built on a decoupled, zero-build static architecture. All visual formatting, responsive grids, and interactive features are handled automatically. The website content itself is completely separated into a single configuration file named portfolio-data.js.</w:t>
+        <w:t>Your website is built with a pure modern web architecture (HTML5, CSS3, Vanilla JavaScript) designed specifically for academic hosting on GitHub Pages. It has zero dependencies, requires no build tools or compilation, and runs with blinding speed.</w:t>
+      </w:r>
+    </w:p>
+    <w:p>
+      <w:r>
+        <w:t>All content on your website is split into two straightforward, user-friendly areas:</w:t>
+      </w:r>
+    </w:p>
+    <w:p>
+      <w:pPr>
+        <w:pStyle w:val="ListBullet"/>
+      </w:pPr>
+      <w:r>
+        <w:rPr>
+          <w:b/>
+        </w:rPr>
+        <w:t xml:space="preserve">portfolio-data.js: </w:t>
+      </w:r>
+      <w:r>
+        <w:t>The single master configuration file controlling text, papers, experience, credentials, and links.</w:t>
+      </w:r>
+    </w:p>
+    <w:p>
+      <w:pPr>
+        <w:pStyle w:val="ListBullet"/>
+      </w:pPr>
+      <w:r>
+        <w:rPr>
+          <w:b/>
+        </w:rPr>
+        <w:t xml:space="preserve">gallery/ folder: </w:t>
+      </w:r>
+      <w:r>
+        <w:t>A dedicated folder in your GitHub repository where you can drop research memories (wet-lab photos, fieldwork, conferences, instrumentation runs). The website automatically detects these photos and displays them live in the Gallery tab!</w:t>
+      </w:r>
+    </w:p>
+    <w:p>
+      <w:pPr>
+        <w:keepNext/>
+        <w:spacing w:before="320" w:after="120"/>
+      </w:pPr>
+      <w:r>
+        <w:rPr>
+          <w:b/>
+          <w:color w:val="059669"/>
+          <w:sz w:val="30"/>
+        </w:rPr>
+        <w:t>2. Automatic GitHub Research Memories Gallery</w:t>
+      </w:r>
+    </w:p>
+    <w:p>
+      <w:r>
+        <w:t>You asked for a folder in your GitHub account where you can drop research photos and have them automatically appear on the website under a dedicated 'Gallery' tab. This feature is now fully implemented and connected!</w:t>
+      </w:r>
+    </w:p>
+    <w:p>
+      <w:pPr>
+        <w:keepNext/>
+        <w:spacing w:before="240" w:after="80"/>
+      </w:pPr>
+      <w:r>
+        <w:rPr>
+          <w:b/>
+          <w:color w:val="0F172A"/>
+          <w:sz w:val="25"/>
+        </w:rPr>
+        <w:t>A. How to Upload Photos via GitHub Web (Zero Coding Needed!)</w:t>
+      </w:r>
+    </w:p>
+    <w:p>
+      <w:r>
+        <w:t>You can upload photos from your smartphone, camera, or laptop directly through the GitHub website without touching any code:</w:t>
+      </w:r>
+    </w:p>
+    <w:p>
+      <w:pPr>
+        <w:pStyle w:val="ListNumber"/>
+      </w:pPr>
+      <w:r>
+        <w:rPr>
+          <w:b/>
+        </w:rPr>
+        <w:t xml:space="preserve">Step 1: Open GitHub Gallery Folder: </w:t>
+      </w:r>
+      <w:r>
+        <w:t>Go to your repository gallery page:</w:t>
+        <w:br/>
+        <w:t>https://github.com/punitsharma16042003/Myportfolio/tree/main/gallery</w:t>
+      </w:r>
+    </w:p>
+    <w:p>
+      <w:pPr>
+        <w:pStyle w:val="ListNumber"/>
+      </w:pPr>
+      <w:r>
+        <w:rPr>
+          <w:b/>
+        </w:rPr>
+        <w:t xml:space="preserve">Step 2: Click 'Add file' &gt; 'Upload files': </w:t>
+      </w:r>
+      <w:r>
+        <w:t>In the top-right corner of the file list, click the 'Add file' dropdown and choose 'Upload files'.</w:t>
+      </w:r>
+    </w:p>
+    <w:p>
+      <w:pPr>
+        <w:pStyle w:val="ListNumber"/>
+      </w:pPr>
+      <w:r>
+        <w:rPr>
+          <w:b/>
+        </w:rPr>
+        <w:t xml:space="preserve">Step 3: Drag &amp; Drop Your Photos: </w:t>
+      </w:r>
+      <w:r>
+        <w:t>Drag and drop your photos into the upload box. Supported formats include .jpg, .jpeg, .png, .webp, .svg, and .gif.</w:t>
+      </w:r>
+    </w:p>
+    <w:p>
+      <w:pPr>
+        <w:pStyle w:val="ListNumber"/>
+      </w:pPr>
+      <w:r>
+        <w:rPr>
+          <w:b/>
+        </w:rPr>
+        <w:t xml:space="preserve">Step 4: Commit Changes: </w:t>
+      </w:r>
+      <w:r>
+        <w:t>Scroll down to the bottom of the page and click the green 'Commit changes' button.</w:t>
+      </w:r>
+    </w:p>
+    <w:p>
+      <w:pPr>
+        <w:keepNext/>
+        <w:spacing w:before="240" w:after="80"/>
+      </w:pPr>
+      <w:r>
+        <w:rPr>
+          <w:b/>
+          <w:color w:val="0F172A"/>
+          <w:sz w:val="25"/>
+        </w:rPr>
+        <w:t>B. Automatic Clean Title Formatting</w:t>
+      </w:r>
+    </w:p>
+    <w:p>
+      <w:r>
+        <w:t>When you upload an image, the website's intelligent loader automatically parses the filename into a clean, capitalized title:</w:t>
+      </w:r>
+    </w:p>
+    <w:p>
+      <w:pPr>
+        <w:pStyle w:val="ListBullet"/>
+      </w:pPr>
+      <w:r>
+        <w:rPr>
+          <w:rFonts w:ascii="Consolas" w:hAnsi="Consolas"/>
+        </w:rPr>
+        <w:t xml:space="preserve">satluj-water-sampling-2024.jpg → </w:t>
+      </w:r>
+      <w:r>
+        <w:rPr>
+          <w:b/>
+        </w:rPr>
+        <w:t>Satluj Water Sampling 2024</w:t>
+      </w:r>
+    </w:p>
+    <w:p>
+      <w:pPr>
+        <w:pStyle w:val="ListBullet"/>
+      </w:pPr>
+      <w:r>
+        <w:rPr>
+          <w:rFonts w:ascii="Consolas" w:hAnsi="Consolas"/>
+        </w:rPr>
+        <w:t xml:space="preserve">cqd-green-photoluminescence.png → </w:t>
+      </w:r>
+      <w:r>
+        <w:rPr>
+          <w:b/>
+        </w:rPr>
+        <w:t>Cqd Green Photoluminescence</w:t>
+      </w:r>
+    </w:p>
+    <w:p>
+      <w:pPr>
+        <w:keepNext/>
+        <w:spacing w:before="240" w:after="80"/>
+      </w:pPr>
+      <w:r>
+        <w:rPr>
+          <w:b/>
+          <w:color w:val="0F172A"/>
+          <w:sz w:val="25"/>
+        </w:rPr>
+        <w:t>C. Optional: Adding Custom Descriptions, Dates &amp; Categories</w:t>
+      </w:r>
+    </w:p>
+    <w:p>
+      <w:r>
+        <w:t>If you want to provide a rich academic description, specific date, location, or filter category ('Wet Lab', 'Fieldwork', 'Instrumentation', 'Conferences'), open portfolio-data.js, locate gallery: [ and paste:</w:t>
       </w:r>
     </w:p>
     <w:tbl>
@@ -275,46 +305,47 @@
         <w:tblLook w:firstColumn="1" w:firstRow="1" w:lastColumn="0" w:lastRow="0" w:noHBand="0" w:noVBand="1" w:val="04A0"/>
       </w:tblPr>
       <w:tblGrid>
-        <w:gridCol w:w="9360"/>
+        <w:gridCol w:w="9936"/>
       </w:tblGrid>
       <w:tr>
         <w:tc>
           <w:tcPr>
-            <w:tcW w:type="dxa" w:w="9360"/>
-            <w:shd w:fill="ECFDF5"/>
-            <w:tcMar>
-              <w:top w:w="120" w:type="dxa"/>
-              <w:bottom w:w="120" w:type="dxa"/>
-              <w:left w:w="180" w:type="dxa"/>
-              <w:right w:w="180" w:type="dxa"/>
-            </w:tcMar>
+            <w:tcW w:type="dxa" w:w="9792"/>
+            <w:shd w:fill="F8FAFC"/>
             <w:tcBorders>
-              <w:top w:val="none"/>
-              <w:bottom w:val="none"/>
-              <w:left w:val="single" w:sz="24" w:space="0" w:color="059669"/>
-              <w:right w:val="none"/>
+              <w:left w:val="single" w:sz="12" w:space="0" w:color="CBD5E1"/>
+              <w:top w:val="single" w:sz="6" w:space="0" w:color="E2E8F0"/>
+              <w:right w:val="single" w:sz="6" w:space="0" w:color="E2E8F0"/>
+              <w:bottom w:val="single" w:sz="6" w:space="0" w:color="E2E8F0"/>
             </w:tcBorders>
           </w:tcPr>
           <w:p>
             <w:pPr>
-              <w:spacing w:before="40" w:after="40"/>
+              <w:spacing w:before="80" w:after="80"/>
             </w:pPr>
             <w:r>
               <w:rPr>
-                <w:rFonts w:ascii="Calibri" w:hAnsi="Calibri"/>
-                <w:b/>
-                <w:color w:val="065F46"/>
-                <w:sz w:val="21"/>
+                <w:rFonts w:ascii="Consolas" w:hAnsi="Consolas"/>
+                <w:color w:val="0F172A"/>
+                <w:sz w:val="19"/>
               </w:rPr>
-              <w:t xml:space="preserve">📌 Zero-Code Guarantee: </w:t>
-            </w:r>
-            <w:r>
-              <w:rPr>
-                <w:rFonts w:ascii="Calibri" w:hAnsi="Calibri"/>
-                <w:color w:val="065F46"/>
-                <w:sz w:val="21"/>
-              </w:rPr>
-              <w:t>You NEVER need to edit index.html or any CSS/JS files. Whenever you add, modify, or delete entries, you only make changes inside portfolio-data.js.</w:t>
+              <w:t>{</w:t>
+              <w:br/>
+              <w:t xml:space="preserve">  id: "mem-satluj-sampling",</w:t>
+              <w:br/>
+              <w:t xml:space="preserve">  image: "gallery/satluj-sampling-run.jpg",</w:t>
+              <w:br/>
+              <w:t xml:space="preserve">  title: "Fieldwork Water Sampling along Satluj River",</w:t>
+              <w:br/>
+              <w:t xml:space="preserve">  caption: "In-situ monitoring of DO, pH, and electrical conductivity followed by heavy metals grab sampling.",</w:t>
+              <w:br/>
+              <w:t xml:space="preserve">  category: "Fieldwork",</w:t>
+              <w:br/>
+              <w:t xml:space="preserve">  date: "October 2024",</w:t>
+              <w:br/>
+              <w:t xml:space="preserve">  location: "Satluj River Basin, Punjab"</w:t>
+              <w:br/>
+              <w:t>},</w:t>
             </w:r>
           </w:p>
         </w:tc>
@@ -322,38 +353,45 @@
     </w:tbl>
     <w:p>
       <w:pPr>
-        <w:spacing w:before="0" w:after="120"/>
+        <w:spacing w:after="80"/>
       </w:pPr>
     </w:p>
     <w:p>
       <w:pPr>
+        <w:keepNext/>
         <w:spacing w:before="320" w:after="120"/>
       </w:pPr>
       <w:r>
         <w:rPr>
           <w:b/>
-          <w:color w:val="0F172A"/>
-          <w:sz w:val="32"/>
+          <w:color w:val="059669"/>
+          <w:sz w:val="30"/>
         </w:rPr>
-        <w:t>2. Protocol to Add New Entries</w:t>
+        <w:t>3. How to Add New Academic Achievements</w:t>
       </w:r>
     </w:p>
     <w:p>
       <w:r>
-        <w:t>To add a new item, open portfolio-data.js in your editor (VS Code, Notepad, etc.). Locate the appropriate list, copy the matching template block below, paste it at the top of the array, and fill in your details.</w:t>
+        <w:t>To add new items to any section, open portfolio-data.js and paste the corresponding template at the top of the matching list.</w:t>
       </w:r>
     </w:p>
     <w:p>
       <w:pPr>
-        <w:pStyle w:val="Heading2"/>
+        <w:keepNext/>
+        <w:spacing w:before="240" w:after="80"/>
       </w:pPr>
       <w:r>
-        <w:t>2.1 Adding a New Publication or Preprint</w:t>
+        <w:rPr>
+          <w:b/>
+          <w:color w:val="0F172A"/>
+          <w:sz w:val="25"/>
+        </w:rPr>
+        <w:t>A. Add a New Publication or Preprint</w:t>
       </w:r>
     </w:p>
     <w:p>
       <w:r>
-        <w:t>Find the publications: [ list (around line 185 in portfolio-data.js) and paste this snippet:</w:t>
+        <w:t>Locate publications: [ and paste:</w:t>
       </w:r>
     </w:p>
     <w:tbl>
@@ -363,29 +401,23 @@
         <w:tblLook w:firstColumn="1" w:firstRow="1" w:lastColumn="0" w:lastRow="0" w:noHBand="0" w:noVBand="1" w:val="04A0"/>
       </w:tblPr>
       <w:tblGrid>
-        <w:gridCol w:w="9360"/>
+        <w:gridCol w:w="9936"/>
       </w:tblGrid>
       <w:tr>
         <w:tc>
           <w:tcPr>
-            <w:tcW w:type="dxa" w:w="9360"/>
-            <w:shd w:fill="F1F5F9"/>
-            <w:tcMar>
-              <w:top w:w="140" w:type="dxa"/>
-              <w:bottom w:w="140" w:type="dxa"/>
-              <w:left w:w="200" w:type="dxa"/>
-              <w:right w:w="200" w:type="dxa"/>
-            </w:tcMar>
+            <w:tcW w:type="dxa" w:w="9792"/>
+            <w:shd w:fill="F8FAFC"/>
             <w:tcBorders>
-              <w:top w:val="single" w:sz="4" w:space="0" w:color="CBD5E1"/>
-              <w:bottom w:val="single" w:sz="4" w:space="0" w:color="CBD5E1"/>
-              <w:left w:val="single" w:sz="18" w:space="0" w:color="059669"/>
-              <w:right w:val="single" w:sz="4" w:space="0" w:color="CBD5E1"/>
+              <w:left w:val="single" w:sz="12" w:space="0" w:color="CBD5E1"/>
+              <w:top w:val="single" w:sz="6" w:space="0" w:color="E2E8F0"/>
+              <w:right w:val="single" w:sz="6" w:space="0" w:color="E2E8F0"/>
+              <w:bottom w:val="single" w:sz="6" w:space="0" w:color="E2E8F0"/>
             </w:tcBorders>
           </w:tcPr>
           <w:p>
             <w:pPr>
-              <w:spacing w:before="40" w:after="40" w:line="276" w:lineRule="auto"/>
+              <w:spacing w:before="80" w:after="80"/>
             </w:pPr>
             <w:r>
               <w:rPr>
@@ -395,31 +427,31 @@
               </w:rPr>
               <w:t>{</w:t>
               <w:br/>
-              <w:t xml:space="preserve">  id: "pub-new",</w:t>
+              <w:t xml:space="preserve">  id: "pub-2026-cqd",</w:t>
               <w:br/>
-              <w:t xml:space="preserve">  title: "Your Paper Title Goes Here",</w:t>
+              <w:t xml:space="preserve">  title: "High-Efficiency Photocatalytic Degradation of Dyes via CQD Nanocomposites",</w:t>
               <w:br/>
-              <w:t xml:space="preserve">  authors: ["Pankaj Sharma", "Co-Author Name", "Principal Investigator"],</w:t>
+              <w:t xml:space="preserve">  authors: ["Pankaj Sharma", "Co-Author Name", "PI Name"],</w:t>
               <w:br/>
-              <w:t xml:space="preserve">  journal: "Journal Name or Preprint Server (e.g. ACS Applied Nano Materials)",</w:t>
+              <w:t xml:space="preserve">  journal: "ACS Applied Nano Materials",</w:t>
               <w:br/>
               <w:t xml:space="preserve">  year: "2026",</w:t>
               <w:br/>
-              <w:t xml:space="preserve">  doi: "https://doi.org/10.xxxx/xxxx", // or null if in preparation</w:t>
+              <w:t xml:space="preserve">  doi: "https://doi.org/10.1021/acsanm.xxxx",</w:t>
               <w:br/>
-              <w:t xml:space="preserve">  type: "Journal Article",             // or "Conference", "Review", "Preprint"</w:t>
+              <w:t xml:space="preserve">  type: "Journal Article",</w:t>
               <w:br/>
-              <w:t xml:space="preserve">  badge: "Published",                  // or "Under Review", "In Preparation"</w:t>
+              <w:t xml:space="preserve">  badge: "Published",</w:t>
               <w:br/>
-              <w:t xml:space="preserve">  abstract: "Brief 2-3 sentence abstract summarizing your findings and significance.",</w:t>
+              <w:t xml:space="preserve">  abstract: "Synthesized fluorescent Carbon Quantum Dots exhibiting 98.4% photodegradation efficiency within 45 minutes under direct solar illumination.",</w:t>
               <w:br/>
-              <w:t xml:space="preserve">  bibtex: `@article{sharma2026paper,</w:t>
+              <w:t xml:space="preserve">  bibtex: `@article{sharma2026cqd,</w:t>
               <w:br/>
-              <w:t xml:space="preserve">  title={Your Paper Title Goes Here},</w:t>
+              <w:t xml:space="preserve">  title={High-Efficiency Photocatalytic Degradation of Dyes via CQD Nanocomposites},</w:t>
               <w:br/>
               <w:t xml:space="preserve">  author={Sharma, Pankaj and Others},</w:t>
               <w:br/>
-              <w:t xml:space="preserve">  journal={Journal Name},</w:t>
+              <w:t xml:space="preserve">  journal={ACS Applied Nano Materials},</w:t>
               <w:br/>
               <w:t xml:space="preserve">  year={2026}</w:t>
               <w:br/>
@@ -433,20 +465,26 @@
     </w:tbl>
     <w:p>
       <w:pPr>
-        <w:spacing w:before="0" w:after="120"/>
+        <w:spacing w:after="80"/>
       </w:pPr>
     </w:p>
     <w:p>
       <w:pPr>
-        <w:pStyle w:val="Heading2"/>
+        <w:keepNext/>
+        <w:spacing w:before="240" w:after="80"/>
       </w:pPr>
       <w:r>
-        <w:t>2.2 Adding a Certificate or Specialized Training</w:t>
+        <w:rPr>
+          <w:b/>
+          <w:color w:val="0F172A"/>
+          <w:sz w:val="25"/>
+        </w:rPr>
+        <w:t>B. Add a New Certification or Training</w:t>
       </w:r>
     </w:p>
     <w:p>
       <w:r>
-        <w:t>Find the certificates: [ list (around line 350 in portfolio-data.js) and paste this snippet:</w:t>
+        <w:t>Locate certificates: [ and paste:</w:t>
       </w:r>
     </w:p>
     <w:tbl>
@@ -456,29 +494,23 @@
         <w:tblLook w:firstColumn="1" w:firstRow="1" w:lastColumn="0" w:lastRow="0" w:noHBand="0" w:noVBand="1" w:val="04A0"/>
       </w:tblPr>
       <w:tblGrid>
-        <w:gridCol w:w="9360"/>
+        <w:gridCol w:w="9936"/>
       </w:tblGrid>
       <w:tr>
         <w:tc>
           <w:tcPr>
-            <w:tcW w:type="dxa" w:w="9360"/>
-            <w:shd w:fill="F1F5F9"/>
-            <w:tcMar>
-              <w:top w:w="140" w:type="dxa"/>
-              <w:bottom w:w="140" w:type="dxa"/>
-              <w:left w:w="200" w:type="dxa"/>
-              <w:right w:w="200" w:type="dxa"/>
-            </w:tcMar>
+            <w:tcW w:type="dxa" w:w="9792"/>
+            <w:shd w:fill="F8FAFC"/>
             <w:tcBorders>
-              <w:top w:val="single" w:sz="4" w:space="0" w:color="CBD5E1"/>
-              <w:bottom w:val="single" w:sz="4" w:space="0" w:color="CBD5E1"/>
-              <w:left w:val="single" w:sz="18" w:space="0" w:color="059669"/>
-              <w:right w:val="single" w:sz="4" w:space="0" w:color="CBD5E1"/>
+              <w:left w:val="single" w:sz="12" w:space="0" w:color="CBD5E1"/>
+              <w:top w:val="single" w:sz="6" w:space="0" w:color="E2E8F0"/>
+              <w:right w:val="single" w:sz="6" w:space="0" w:color="E2E8F0"/>
+              <w:bottom w:val="single" w:sz="6" w:space="0" w:color="E2E8F0"/>
             </w:tcBorders>
           </w:tcPr>
           <w:p>
             <w:pPr>
-              <w:spacing w:before="40" w:after="40" w:line="276" w:lineRule="auto"/>
+              <w:spacing w:before="80" w:after="80"/>
             </w:pPr>
             <w:r>
               <w:rPr>
@@ -488,23 +520,23 @@
               </w:rPr>
               <w:t>{</w:t>
               <w:br/>
-              <w:t xml:space="preserve">  id: "cert-new",</w:t>
+              <w:t xml:space="preserve">  id: "cert-iit-spectroscopy",</w:t>
               <w:br/>
-              <w:t xml:space="preserve">  title: "Name of the Training Program or Certification",</w:t>
+              <w:t xml:space="preserve">  title: "Advanced Spectroscopy &amp; Mass Spectrometry Training",</w:t>
               <w:br/>
-              <w:t xml:space="preserve">  organization: "Issuing Body (e.g. IIT Delhi / Royal Society of Chemistry)",</w:t>
+              <w:t xml:space="preserve">  organization: "Indian Institute of Technology (IIT) Delhi",</w:t>
               <w:br/>
               <w:t xml:space="preserve">  date: "2026",</w:t>
               <w:br/>
-              <w:t xml:space="preserve">  category: "Instrumentation Training", // Controls filter tabs</w:t>
+              <w:t xml:space="preserve">  category: "Instrumentation Training",</w:t>
               <w:br/>
-              <w:t xml:space="preserve">  badge: "Specialized Training",       // Small pill tag</w:t>
+              <w:t xml:space="preserve">  badge: "Specialized Training",</w:t>
               <w:br/>
-              <w:t xml:space="preserve">  description: "Summary of analytical techniques learned or instruments operated.",</w:t>
+              <w:t xml:space="preserve">  description: "Hands-on operator training for ICP-MS, AAS, and high-resolution UV-Vis spectrophotometry.",</w:t>
               <w:br/>
-              <w:t xml:space="preserve">  link: "https://verification-link.com", // or null if no link</w:t>
+              <w:t xml:space="preserve">  link: null,</w:t>
               <w:br/>
-              <w:t xml:space="preserve">  highlight: true                        // true gives prominent shadow border</w:t>
+              <w:t xml:space="preserve">  highlight: true</w:t>
               <w:br/>
               <w:t>},</w:t>
             </w:r>
@@ -514,20 +546,26 @@
     </w:tbl>
     <w:p>
       <w:pPr>
-        <w:spacing w:before="0" w:after="120"/>
+        <w:spacing w:after="80"/>
       </w:pPr>
     </w:p>
     <w:p>
       <w:pPr>
-        <w:pStyle w:val="Heading2"/>
+        <w:keepNext/>
+        <w:spacing w:before="240" w:after="80"/>
       </w:pPr>
       <w:r>
-        <w:t>2.3 Adding a GitHub Tool / Vibe-Coding Project</w:t>
+        <w:rPr>
+          <w:b/>
+          <w:color w:val="0F172A"/>
+          <w:sz w:val="25"/>
+        </w:rPr>
+        <w:t>C. Add a New Coding or AI Tool</w:t>
       </w:r>
     </w:p>
     <w:p>
       <w:r>
-        <w:t>Find the githubProjects: [ list (around line 135 in portfolio-data.js) and paste this snippet:</w:t>
+        <w:t>Locate githubProjects: [ and paste:</w:t>
       </w:r>
     </w:p>
     <w:tbl>
@@ -537,29 +575,23 @@
         <w:tblLook w:firstColumn="1" w:firstRow="1" w:lastColumn="0" w:lastRow="0" w:noHBand="0" w:noVBand="1" w:val="04A0"/>
       </w:tblPr>
       <w:tblGrid>
-        <w:gridCol w:w="9360"/>
+        <w:gridCol w:w="9936"/>
       </w:tblGrid>
       <w:tr>
         <w:tc>
           <w:tcPr>
-            <w:tcW w:type="dxa" w:w="9360"/>
-            <w:shd w:fill="F1F5F9"/>
-            <w:tcMar>
-              <w:top w:w="140" w:type="dxa"/>
-              <w:bottom w:w="140" w:type="dxa"/>
-              <w:left w:w="200" w:type="dxa"/>
-              <w:right w:w="200" w:type="dxa"/>
-            </w:tcMar>
+            <w:tcW w:type="dxa" w:w="9792"/>
+            <w:shd w:fill="F8FAFC"/>
             <w:tcBorders>
-              <w:top w:val="single" w:sz="4" w:space="0" w:color="CBD5E1"/>
-              <w:bottom w:val="single" w:sz="4" w:space="0" w:color="CBD5E1"/>
-              <w:left w:val="single" w:sz="18" w:space="0" w:color="059669"/>
-              <w:right w:val="single" w:sz="4" w:space="0" w:color="CBD5E1"/>
+              <w:left w:val="single" w:sz="12" w:space="0" w:color="CBD5E1"/>
+              <w:top w:val="single" w:sz="6" w:space="0" w:color="E2E8F0"/>
+              <w:right w:val="single" w:sz="6" w:space="0" w:color="E2E8F0"/>
+              <w:bottom w:val="single" w:sz="6" w:space="0" w:color="E2E8F0"/>
             </w:tcBorders>
           </w:tcPr>
           <w:p>
             <w:pPr>
-              <w:spacing w:before="40" w:after="40" w:line="276" w:lineRule="auto"/>
+              <w:spacing w:before="80" w:after="80"/>
             </w:pPr>
             <w:r>
               <w:rPr>
@@ -569,17 +601,17 @@
               </w:rPr>
               <w:t>{</w:t>
               <w:br/>
-              <w:t xml:space="preserve">  id: "gh-new",</w:t>
+              <w:t xml:space="preserve">  id: "gh-chemlab-pro",</w:t>
               <w:br/>
-              <w:t xml:space="preserve">  title: "TOOL-NAME",</w:t>
+              <w:t xml:space="preserve">  title: "CHEMLAB-PRO",</w:t>
               <w:br/>
-              <w:t xml:space="preserve">  tagline: "Short 5-Word Description of Application",</w:t>
+              <w:t xml:space="preserve">  tagline: "Analytical Chemistry Data Suite",</w:t>
               <w:br/>
-              <w:t xml:space="preserve">  description: "Detailed description of what the software does and the chemical/lab problem it solves.",</w:t>
+              <w:t xml:space="preserve">  description: "Automates spectrophotometric calibration, Beer-Lambert calculations, and LOD/LOQ generation.",</w:t>
               <w:br/>
-              <w:t xml:space="preserve">  tags: ["Python", "JavaScript", "SQL", "Streamlit"],</w:t>
+              <w:t xml:space="preserve">  tags: ["Python", "Streamlit", "NumPy", "Data Analytics"],</w:t>
               <w:br/>
-              <w:t xml:space="preserve">  githubUrl: "https://github.com/punitsharma16042003/your-repo-name",</w:t>
+              <w:t xml:space="preserve">  githubUrl: "https://github.com/punitsharma16042003/chemlab-pro",</w:t>
               <w:br/>
               <w:t xml:space="preserve">  stars: "Featured",</w:t>
               <w:br/>
@@ -593,20 +625,69 @@
     </w:tbl>
     <w:p>
       <w:pPr>
-        <w:spacing w:before="0" w:after="120"/>
+        <w:spacing w:after="80"/>
       </w:pPr>
     </w:p>
     <w:p>
       <w:pPr>
-        <w:pStyle w:val="Heading2"/>
+        <w:keepNext/>
+        <w:spacing w:before="320" w:after="120"/>
       </w:pPr>
       <w:r>
-        <w:t>2.4 Adding an Experimental Laboratory Project</w:t>
+        <w:rPr>
+          <w:b/>
+          <w:color w:val="059669"/>
+          <w:sz w:val="30"/>
+        </w:rPr>
+        <w:t>4. How to Remove Any Entry</w:t>
       </w:r>
     </w:p>
     <w:p>
       <w:r>
-        <w:t>Find the projects: [ list (around line 90 in portfolio-data.js) and paste this snippet:</w:t>
+        <w:t>Removing an entry takes just 3 simple steps:</w:t>
+      </w:r>
+    </w:p>
+    <w:p>
+      <w:pPr>
+        <w:pStyle w:val="ListNumber"/>
+      </w:pPr>
+      <w:r>
+        <w:t>Open portfolio-data.js in any text editor (Notepad, VS Code).</w:t>
+      </w:r>
+    </w:p>
+    <w:p>
+      <w:pPr>
+        <w:pStyle w:val="ListNumber"/>
+      </w:pPr>
+      <w:r>
+        <w:t>Press Ctrl + F and search for the title or name of the entry you want to delete.</w:t>
+      </w:r>
+    </w:p>
+    <w:p>
+      <w:pPr>
+        <w:pStyle w:val="ListNumber"/>
+      </w:pPr>
+      <w:r>
+        <w:t>Select the entire block between { and }, (including the trailing comma) and delete it. Save the file!</w:t>
+      </w:r>
+    </w:p>
+    <w:p>
+      <w:pPr>
+        <w:keepNext/>
+        <w:spacing w:before="320" w:after="120"/>
+      </w:pPr>
+      <w:r>
+        <w:rPr>
+          <w:b/>
+          <w:color w:val="059669"/>
+          <w:sz w:val="30"/>
+        </w:rPr>
+        <w:t>5. Publishing Changes to GitHub Pages</w:t>
+      </w:r>
+    </w:p>
+    <w:p>
+      <w:r>
+        <w:t>Whenever you make edits locally on your computer, push them live with these 3 standard Git commands:</w:t>
       </w:r>
     </w:p>
     <w:tbl>
@@ -616,423 +697,23 @@
         <w:tblLook w:firstColumn="1" w:firstRow="1" w:lastColumn="0" w:lastRow="0" w:noHBand="0" w:noVBand="1" w:val="04A0"/>
       </w:tblPr>
       <w:tblGrid>
-        <w:gridCol w:w="9360"/>
+        <w:gridCol w:w="9936"/>
       </w:tblGrid>
       <w:tr>
         <w:tc>
           <w:tcPr>
-            <w:tcW w:type="dxa" w:w="9360"/>
-            <w:shd w:fill="F1F5F9"/>
-            <w:tcMar>
-              <w:top w:w="140" w:type="dxa"/>
-              <w:bottom w:w="140" w:type="dxa"/>
-              <w:left w:w="200" w:type="dxa"/>
-              <w:right w:w="200" w:type="dxa"/>
-            </w:tcMar>
+            <w:tcW w:type="dxa" w:w="9792"/>
+            <w:shd w:fill="F8FAFC"/>
             <w:tcBorders>
-              <w:top w:val="single" w:sz="4" w:space="0" w:color="CBD5E1"/>
-              <w:bottom w:val="single" w:sz="4" w:space="0" w:color="CBD5E1"/>
-              <w:left w:val="single" w:sz="18" w:space="0" w:color="059669"/>
-              <w:right w:val="single" w:sz="4" w:space="0" w:color="CBD5E1"/>
+              <w:left w:val="single" w:sz="12" w:space="0" w:color="CBD5E1"/>
+              <w:top w:val="single" w:sz="6" w:space="0" w:color="E2E8F0"/>
+              <w:right w:val="single" w:sz="6" w:space="0" w:color="E2E8F0"/>
+              <w:bottom w:val="single" w:sz="6" w:space="0" w:color="E2E8F0"/>
             </w:tcBorders>
           </w:tcPr>
           <w:p>
             <w:pPr>
-              <w:spacing w:before="40" w:after="40" w:line="276" w:lineRule="auto"/>
-            </w:pPr>
-            <w:r>
-              <w:rPr>
-                <w:rFonts w:ascii="Consolas" w:hAnsi="Consolas"/>
-                <w:color w:val="0F172A"/>
-                <w:sz w:val="19"/>
-              </w:rPr>
-              <w:t>{</w:t>
-              <w:br/>
-              <w:t xml:space="preserve">  id: "lab-proj-new",</w:t>
-              <w:br/>
-              <w:t xml:space="preserve">  title: "Project Title Describing Experimental Scope",</w:t>
-              <w:br/>
-              <w:t xml:space="preserve">  institution: "Indian Institute of Technology (IIT), Ropar",</w:t>
-              <w:br/>
-              <w:t xml:space="preserve">  period: "2026 – Present",</w:t>
-              <w:br/>
-              <w:t xml:space="preserve">  category: "Nanotechnology", // or "Environmental Chemistry", "Catalysis"</w:t>
-              <w:br/>
-              <w:t xml:space="preserve">  description: "Comprehensive summary of research scope, precursors utilized, and parameters measured.",</w:t>
-              <w:br/>
-              <w:t xml:space="preserve">  highlights: [</w:t>
-              <w:br/>
-              <w:t xml:space="preserve">    "First key experimental finding or synthesis milestone.",</w:t>
-              <w:br/>
-              <w:t xml:space="preserve">    "Second key finding regarding characterization (SEM, XRD, UV-Vis).",</w:t>
-              <w:br/>
-              <w:t xml:space="preserve">    "Third key finding regarding real-world application or efficiency."</w:t>
-              <w:br/>
-              <w:t xml:space="preserve">  ],</w:t>
-              <w:br/>
-              <w:t xml:space="preserve">  tags: ["CQDs", "Nanomaterials", "Analytical Chemistry", "IIT Ropar"],</w:t>
-              <w:br/>
-              <w:t xml:space="preserve">  link: null</w:t>
-              <w:br/>
-              <w:t>},</w:t>
-            </w:r>
-          </w:p>
-        </w:tc>
-      </w:tr>
-    </w:tbl>
-    <w:p>
-      <w:pPr>
-        <w:spacing w:before="0" w:after="120"/>
-      </w:pPr>
-    </w:p>
-    <w:p>
-      <w:pPr>
-        <w:pStyle w:val="Heading2"/>
-      </w:pPr>
-      <w:r>
-        <w:t>2.5 Adding a Work / Research Experience Position</w:t>
-      </w:r>
-    </w:p>
-    <w:p>
-      <w:r>
-        <w:t>Find the experience: [ list (around line 240 in portfolio-data.js) and paste this snippet:</w:t>
-      </w:r>
-    </w:p>
-    <w:tbl>
-      <w:tblPr>
-        <w:tblW w:type="auto" w:w="0"/>
-        <w:jc w:val="center"/>
-        <w:tblLook w:firstColumn="1" w:firstRow="1" w:lastColumn="0" w:lastRow="0" w:noHBand="0" w:noVBand="1" w:val="04A0"/>
-      </w:tblPr>
-      <w:tblGrid>
-        <w:gridCol w:w="9360"/>
-      </w:tblGrid>
-      <w:tr>
-        <w:tc>
-          <w:tcPr>
-            <w:tcW w:type="dxa" w:w="9360"/>
-            <w:shd w:fill="F1F5F9"/>
-            <w:tcMar>
-              <w:top w:w="140" w:type="dxa"/>
-              <w:bottom w:w="140" w:type="dxa"/>
-              <w:left w:w="200" w:type="dxa"/>
-              <w:right w:w="200" w:type="dxa"/>
-            </w:tcMar>
-            <w:tcBorders>
-              <w:top w:val="single" w:sz="4" w:space="0" w:color="CBD5E1"/>
-              <w:bottom w:val="single" w:sz="4" w:space="0" w:color="CBD5E1"/>
-              <w:left w:val="single" w:sz="18" w:space="0" w:color="059669"/>
-              <w:right w:val="single" w:sz="4" w:space="0" w:color="CBD5E1"/>
-            </w:tcBorders>
-          </w:tcPr>
-          <w:p>
-            <w:pPr>
-              <w:spacing w:before="40" w:after="40" w:line="276" w:lineRule="auto"/>
-            </w:pPr>
-            <w:r>
-              <w:rPr>
-                <w:rFonts w:ascii="Consolas" w:hAnsi="Consolas"/>
-                <w:color w:val="0F172A"/>
-                <w:sz w:val="19"/>
-              </w:rPr>
-              <w:t>{</w:t>
-              <w:br/>
-              <w:t xml:space="preserve">  id: "exp-new",</w:t>
-              <w:br/>
-              <w:t xml:space="preserve">  role: "Your Designation / Position Title",</w:t>
-              <w:br/>
-              <w:t xml:space="preserve">  organization: "Organization / University / Institute Name",</w:t>
-              <w:br/>
-              <w:t xml:space="preserve">  location: "City, State, Country",</w:t>
-              <w:br/>
-              <w:t xml:space="preserve">  period: "MM/YYYY – Present",</w:t>
-              <w:br/>
-              <w:t xml:space="preserve">  type: "Research &amp; Development",</w:t>
-              <w:br/>
-              <w:t xml:space="preserve">  bullets: [</w:t>
-              <w:br/>
-              <w:t xml:space="preserve">    "First major responsibility, laboratory technique, or audit scope.",</w:t>
-              <w:br/>
-              <w:t xml:space="preserve">    "Second major technical contribution, instrument calibrated, or parameter analyzed.",</w:t>
-              <w:br/>
-              <w:t xml:space="preserve">    "Third major accomplishment, safety compliance outcome, or report authored."</w:t>
-              <w:br/>
-              <w:t xml:space="preserve">  ]</w:t>
-              <w:br/>
-              <w:t>},</w:t>
-            </w:r>
-          </w:p>
-        </w:tc>
-      </w:tr>
-    </w:tbl>
-    <w:p>
-      <w:pPr>
-        <w:spacing w:before="0" w:after="120"/>
-      </w:pPr>
-    </w:p>
-    <w:p>
-      <w:pPr>
-        <w:pStyle w:val="Heading2"/>
-      </w:pPr>
-      <w:r>
-        <w:t>2.6 Adding a New Skill, Instrument or Software</w:t>
-      </w:r>
-    </w:p>
-    <w:p>
-      <w:r>
-        <w:t>Find the skills: { section (around line 300 in portfolio-data.js) and simply add your new item to the matching list inside quotes:</w:t>
-      </w:r>
-    </w:p>
-    <w:tbl>
-      <w:tblPr>
-        <w:tblW w:type="auto" w:w="0"/>
-        <w:jc w:val="center"/>
-        <w:tblLook w:firstColumn="1" w:firstRow="1" w:lastColumn="0" w:lastRow="0" w:noHBand="0" w:noVBand="1" w:val="04A0"/>
-      </w:tblPr>
-      <w:tblGrid>
-        <w:gridCol w:w="9360"/>
-      </w:tblGrid>
-      <w:tr>
-        <w:tc>
-          <w:tcPr>
-            <w:tcW w:type="dxa" w:w="9360"/>
-            <w:shd w:fill="F1F5F9"/>
-            <w:tcMar>
-              <w:top w:w="140" w:type="dxa"/>
-              <w:bottom w:w="140" w:type="dxa"/>
-              <w:left w:w="200" w:type="dxa"/>
-              <w:right w:w="200" w:type="dxa"/>
-            </w:tcMar>
-            <w:tcBorders>
-              <w:top w:val="single" w:sz="4" w:space="0" w:color="CBD5E1"/>
-              <w:bottom w:val="single" w:sz="4" w:space="0" w:color="CBD5E1"/>
-              <w:left w:val="single" w:sz="18" w:space="0" w:color="059669"/>
-              <w:right w:val="single" w:sz="4" w:space="0" w:color="CBD5E1"/>
-            </w:tcBorders>
-          </w:tcPr>
-          <w:p>
-            <w:pPr>
-              <w:spacing w:before="40" w:after="40" w:line="276" w:lineRule="auto"/>
-            </w:pPr>
-            <w:r>
-              <w:rPr>
-                <w:rFonts w:ascii="Consolas" w:hAnsi="Consolas"/>
-                <w:color w:val="0F172A"/>
-                <w:sz w:val="19"/>
-              </w:rPr>
-              <w:t>instrumentation: [</w:t>
-              <w:br/>
-              <w:t xml:space="preserve">  "Nuclear Magnetic Resonance (NMR)",</w:t>
-              <w:br/>
-              <w:t xml:space="preserve">  "UV-Vis Spectrophotometer",</w:t>
-              <w:br/>
-              <w:t xml:space="preserve">  // ... existing instruments</w:t>
-              <w:br/>
-              <w:t>],</w:t>
-            </w:r>
-          </w:p>
-        </w:tc>
-      </w:tr>
-    </w:tbl>
-    <w:p>
-      <w:pPr>
-        <w:spacing w:before="0" w:after="120"/>
-      </w:pPr>
-    </w:p>
-    <w:p>
-      <w:pPr>
-        <w:spacing w:before="320" w:after="120"/>
-      </w:pPr>
-      <w:r>
-        <w:rPr>
-          <w:b/>
-          <w:color w:val="0F172A"/>
-          <w:sz w:val="32"/>
-        </w:rPr>
-        <w:t>3. Protocol to Remove an Existing Entry</w:t>
-      </w:r>
-    </w:p>
-    <w:p>
-      <w:r>
-        <w:t>To permanently remove an item from your website:</w:t>
-        <w:br/>
-        <w:t>1. Open portfolio-data.js.</w:t>
-        <w:br/>
-        <w:t>2. Press Ctrl + F to search for the title of the entry you want to delete.</w:t>
-        <w:br/>
-        <w:t>3. Select and delete the entire { ... } block (including the trailing comma).</w:t>
-        <w:br/>
-        <w:t>4. Save the file. The website card will automatically vanish.</w:t>
-      </w:r>
-    </w:p>
-    <w:p>
-      <w:r>
-        <w:t>Visual Example of Deletion:</w:t>
-      </w:r>
-    </w:p>
-    <w:tbl>
-      <w:tblPr>
-        <w:tblW w:type="auto" w:w="0"/>
-        <w:jc w:val="center"/>
-        <w:tblLook w:firstColumn="1" w:firstRow="1" w:lastColumn="0" w:lastRow="0" w:noHBand="0" w:noVBand="1" w:val="04A0"/>
-      </w:tblPr>
-      <w:tblGrid>
-        <w:gridCol w:w="9360"/>
-      </w:tblGrid>
-      <w:tr>
-        <w:tc>
-          <w:tcPr>
-            <w:tcW w:type="dxa" w:w="9360"/>
-            <w:shd w:fill="F1F5F9"/>
-            <w:tcMar>
-              <w:top w:w="140" w:type="dxa"/>
-              <w:bottom w:w="140" w:type="dxa"/>
-              <w:left w:w="200" w:type="dxa"/>
-              <w:right w:w="200" w:type="dxa"/>
-            </w:tcMar>
-            <w:tcBorders>
-              <w:top w:val="single" w:sz="4" w:space="0" w:color="CBD5E1"/>
-              <w:bottom w:val="single" w:sz="4" w:space="0" w:color="CBD5E1"/>
-              <w:left w:val="single" w:sz="18" w:space="0" w:color="059669"/>
-              <w:right w:val="single" w:sz="4" w:space="0" w:color="CBD5E1"/>
-            </w:tcBorders>
-          </w:tcPr>
-          <w:p>
-            <w:pPr>
-              <w:spacing w:before="40" w:after="40" w:line="276" w:lineRule="auto"/>
-            </w:pPr>
-            <w:r>
-              <w:rPr>
-                <w:rFonts w:ascii="Consolas" w:hAnsi="Consolas"/>
-                <w:color w:val="0F172A"/>
-                <w:sz w:val="19"/>
-              </w:rPr>
-              <w:t>// BEFORE (Delete Certificate B):</w:t>
-              <w:br/>
-              <w:t>certificates: [</w:t>
-              <w:br/>
-              <w:t xml:space="preserve">  {</w:t>
-              <w:br/>
-              <w:t xml:space="preserve">    id: "cert-1",</w:t>
-              <w:br/>
-              <w:t xml:space="preserve">    title: "Certificate A",</w:t>
-              <w:br/>
-              <w:t xml:space="preserve">    ...</w:t>
-              <w:br/>
-              <w:t xml:space="preserve">  },</w:t>
-              <w:br/>
-              <w:t xml:space="preserve">  {</w:t>
-              <w:br/>
-              <w:t xml:space="preserve">    id: "cert-2",</w:t>
-              <w:br/>
-              <w:t xml:space="preserve">    title: "Certificate B (To Delete)",  &lt;--- SELECT &amp; DELETE THIS WHOLE BLOCK</w:t>
-              <w:br/>
-              <w:t xml:space="preserve">    ...</w:t>
-              <w:br/>
-              <w:t xml:space="preserve">  }</w:t>
-              <w:br/>
-              <w:t>]</w:t>
-              <w:br/>
-              <w:br/>
-              <w:t>// AFTER:</w:t>
-              <w:br/>
-              <w:t>certificates: [</w:t>
-              <w:br/>
-              <w:t xml:space="preserve">  {</w:t>
-              <w:br/>
-              <w:t xml:space="preserve">    id: "cert-1",</w:t>
-              <w:br/>
-              <w:t xml:space="preserve">    title: "Certificate A",</w:t>
-              <w:br/>
-              <w:t xml:space="preserve">    ...</w:t>
-              <w:br/>
-              <w:t xml:space="preserve">  }</w:t>
-              <w:br/>
-              <w:t>]</w:t>
-            </w:r>
-          </w:p>
-        </w:tc>
-      </w:tr>
-    </w:tbl>
-    <w:p>
-      <w:pPr>
-        <w:spacing w:before="0" w:after="120"/>
-      </w:pPr>
-    </w:p>
-    <w:p>
-      <w:pPr>
-        <w:spacing w:before="320" w:after="120"/>
-      </w:pPr>
-      <w:r>
-        <w:rPr>
-          <w:b/>
-          <w:color w:val="0F172A"/>
-          <w:sz w:val="32"/>
-        </w:rPr>
-        <w:t>4. Protocol to Update Personal Bio, Photo &amp; Resume</w:t>
-      </w:r>
-    </w:p>
-    <w:p>
-      <w:r>
-        <w:t>• To update your Bio / Summary: Edit personalInfo.summary in portfolio-data.js.</w:t>
-        <w:br/>
-        <w:t>• To update your Titles: Edit the personalInfo.titles array.</w:t>
-        <w:br/>
-        <w:t>• To update your Google Scholar or ORCID: Edit personalInfo.googleScholarUrl or personalInfo.orcidUrl.</w:t>
-        <w:br/>
-        <w:t>• To update your Profile Photo: Save your new image in the project root folder as profile.jpg (overwriting the old one).</w:t>
-        <w:br/>
-        <w:t>• To update your Resume / CV: Save your new PDF in the project root folder as resume.pdf (overwriting the old one).</w:t>
-      </w:r>
-    </w:p>
-    <w:p>
-      <w:pPr>
-        <w:spacing w:before="320" w:after="120"/>
-      </w:pPr>
-      <w:r>
-        <w:rPr>
-          <w:b/>
-          <w:color w:val="0F172A"/>
-          <w:sz w:val="32"/>
-        </w:rPr>
-        <w:t>5. Protocol to Publish Changes Live to GitHub Pages</w:t>
-      </w:r>
-    </w:p>
-    <w:p>
-      <w:r>
-        <w:t>Whenever you finish editing portfolio-data.js or updating your resume/photo, run these 3 simple commands in your terminal or Command Prompt inside the portfolio folder:</w:t>
-      </w:r>
-    </w:p>
-    <w:tbl>
-      <w:tblPr>
-        <w:tblW w:type="auto" w:w="0"/>
-        <w:jc w:val="center"/>
-        <w:tblLook w:firstColumn="1" w:firstRow="1" w:lastColumn="0" w:lastRow="0" w:noHBand="0" w:noVBand="1" w:val="04A0"/>
-      </w:tblPr>
-      <w:tblGrid>
-        <w:gridCol w:w="9360"/>
-      </w:tblGrid>
-      <w:tr>
-        <w:tc>
-          <w:tcPr>
-            <w:tcW w:type="dxa" w:w="9360"/>
-            <w:shd w:fill="F1F5F9"/>
-            <w:tcMar>
-              <w:top w:w="140" w:type="dxa"/>
-              <w:bottom w:w="140" w:type="dxa"/>
-              <w:left w:w="200" w:type="dxa"/>
-              <w:right w:w="200" w:type="dxa"/>
-            </w:tcMar>
-            <w:tcBorders>
-              <w:top w:val="single" w:sz="4" w:space="0" w:color="CBD5E1"/>
-              <w:bottom w:val="single" w:sz="4" w:space="0" w:color="CBD5E1"/>
-              <w:left w:val="single" w:sz="18" w:space="0" w:color="059669"/>
-              <w:right w:val="single" w:sz="4" w:space="0" w:color="CBD5E1"/>
-            </w:tcBorders>
-          </w:tcPr>
-          <w:p>
-            <w:pPr>
-              <w:spacing w:before="40" w:after="40" w:line="276" w:lineRule="auto"/>
+              <w:spacing w:before="80" w:after="80"/>
             </w:pPr>
             <w:r>
               <w:rPr>
@@ -1042,7 +723,7 @@
               </w:rPr>
               <w:t>git add .</w:t>
               <w:br/>
-              <w:t>git commit -m "update: added new research publication"</w:t>
+              <w:t>git commit -m "Update portfolio: added new photo and training certificate"</w:t>
               <w:br/>
               <w:t>git push origin main</w:t>
             </w:r>
@@ -1052,69 +733,17 @@
     </w:tbl>
     <w:p>
       <w:pPr>
-        <w:spacing w:before="0" w:after="120"/>
+        <w:spacing w:after="80"/>
       </w:pPr>
     </w:p>
-    <w:tbl>
-      <w:tblPr>
-        <w:tblW w:type="auto" w:w="0"/>
-        <w:jc w:val="center"/>
-        <w:tblLook w:firstColumn="1" w:firstRow="1" w:lastColumn="0" w:lastRow="0" w:noHBand="0" w:noVBand="1" w:val="04A0"/>
-      </w:tblPr>
-      <w:tblGrid>
-        <w:gridCol w:w="9360"/>
-      </w:tblGrid>
-      <w:tr>
-        <w:tc>
-          <w:tcPr>
-            <w:tcW w:type="dxa" w:w="9360"/>
-            <w:shd w:fill="ECFDF5"/>
-            <w:tcMar>
-              <w:top w:w="120" w:type="dxa"/>
-              <w:bottom w:w="120" w:type="dxa"/>
-              <w:left w:w="180" w:type="dxa"/>
-              <w:right w:w="180" w:type="dxa"/>
-            </w:tcMar>
-            <w:tcBorders>
-              <w:top w:val="none"/>
-              <w:bottom w:val="none"/>
-              <w:left w:val="single" w:sz="24" w:space="0" w:color="059669"/>
-              <w:right w:val="none"/>
-            </w:tcBorders>
-          </w:tcPr>
-          <w:p>
-            <w:pPr>
-              <w:spacing w:before="40" w:after="40"/>
-            </w:pPr>
-            <w:r>
-              <w:rPr>
-                <w:rFonts w:ascii="Calibri" w:hAnsi="Calibri"/>
-                <w:b/>
-                <w:color w:val="065F46"/>
-                <w:sz w:val="21"/>
-              </w:rPr>
-              <w:t xml:space="preserve">📌 Deployment Guarantee: </w:t>
-            </w:r>
-            <w:r>
-              <w:rPr>
-                <w:rFonts w:ascii="Calibri" w:hAnsi="Calibri"/>
-                <w:color w:val="065F46"/>
-                <w:sz w:val="21"/>
-              </w:rPr>
-              <w:t>Once you run git push, GitHub automatically rebuilds your website in ~60 seconds. Your updates will immediately be live worldwide at: https://punitsharma16042003.github.io/Myportfolio/</w:t>
-            </w:r>
-          </w:p>
-        </w:tc>
-      </w:tr>
-    </w:tbl>
     <w:p>
-      <w:pPr>
-        <w:spacing w:before="0" w:after="120"/>
-      </w:pPr>
+      <w:r>
+        <w:t>Within 60 to 90 seconds, GitHub Pages will automatically refresh and your website will be live worldwide!</w:t>
+      </w:r>
     </w:p>
     <w:sectPr>
       <w:pgSz w:w="12240" w:h="15840"/>
-      <w:pgMar w:top="1440" w:right="1440" w:bottom="1440" w:left="1440" w:header="720" w:footer="720" w:gutter="0"/>
+      <w:pgMar w:top="1152" w:right="1152" w:bottom="1152" w:left="1152" w:header="720" w:footer="720" w:gutter="0"/>
       <w:cols w:space="720"/>
       <w:docGrid w:linePitch="360"/>
     </w:sectPr>
@@ -1485,9 +1114,6 @@
     <w:name w:val="Normal"/>
     <w:qFormat/>
     <w:rsid w:val="00FC693F"/>
-    <w:pPr>
-      <w:spacing w:line="288" w:lineRule="auto" w:after="120"/>
-    </w:pPr>
     <w:rPr>
       <w:rFonts w:ascii="Calibri" w:hAnsi="Calibri"/>
       <w:color w:val="1E293B"/>

</xml_diff>

<commit_message>
chore: remove Gallery tab from website for later review while keeping photos safely preserved
</commit_message>
<xml_diff>
--- a/Portfolio_Instruction_Manual.docx
+++ b/Portfolio_Instruction_Manual.docx
@@ -27,7 +27,7 @@
           <w:color w:val="64748B"/>
           <w:sz w:val="26"/>
         </w:rPr>
-        <w:t>Master User Manual &amp; Protocol: Adding/Removing Content &amp; Automatic GitHub Gallery</w:t>
+        <w:t>Master User Manual &amp; Protocol: Adding, Editing &amp; Removing Achievements</w:t>
       </w:r>
     </w:p>
     <w:tbl>
@@ -67,7 +67,7 @@
               <w:br/>
               <w:t>✨ Master Data File: portfolio-data.js (Zero HTML/CSS editing needed)</w:t>
               <w:br/>
-              <w:t>📸 Automatic Photos Folder: gallery/ (Drop photos on GitHub to display instantly!)</w:t>
+              <w:t>📸 Research Photos Storage: gallery/ (Photos safely stored for future use)</w:t>
             </w:r>
           </w:p>
         </w:tc>
@@ -89,45 +89,17 @@
           <w:color w:val="059669"/>
           <w:sz w:val="30"/>
         </w:rPr>
-        <w:t>1. Overview &amp; Architecture</w:t>
+        <w:t>1. Master Overview: Your Website is Fully Data-Driven</w:t>
       </w:r>
     </w:p>
     <w:p>
       <w:r>
-        <w:t>Your website is built with a pure modern web architecture (HTML5, CSS3, Vanilla JavaScript) designed specifically for academic hosting on GitHub Pages. It has zero dependencies, requires no build tools or compilation, and runs with blinding speed.</w:t>
+        <w:t>Your research portfolio is built with modern HTML5, CSS3, and Vanilla JavaScript, hosted on GitHub Pages. You never need to touch HTML or CSS files when updating your achievements.</w:t>
       </w:r>
     </w:p>
     <w:p>
       <w:r>
-        <w:t>All content on your website is split into two straightforward, user-friendly areas:</w:t>
-      </w:r>
-    </w:p>
-    <w:p>
-      <w:pPr>
-        <w:pStyle w:val="ListBullet"/>
-      </w:pPr>
-      <w:r>
-        <w:rPr>
-          <w:b/>
-        </w:rPr>
-        <w:t xml:space="preserve">portfolio-data.js: </w:t>
-      </w:r>
-      <w:r>
-        <w:t>The single master configuration file controlling text, papers, experience, credentials, and links.</w:t>
-      </w:r>
-    </w:p>
-    <w:p>
-      <w:pPr>
-        <w:pStyle w:val="ListBullet"/>
-      </w:pPr>
-      <w:r>
-        <w:rPr>
-          <w:b/>
-        </w:rPr>
-        <w:t xml:space="preserve">gallery/ folder: </w:t>
-      </w:r>
-      <w:r>
-        <w:t>A dedicated folder in your GitHub repository where you can drop research memories (wet-lab photos, fieldwork, conferences, instrumentation runs). The website automatically detects these photos and displays them live in the Gallery tab!</w:t>
+        <w:t>The entire website reads from one single master configuration file: portfolio-data.js</w:t>
       </w:r>
     </w:p>
     <w:p>
@@ -141,238 +113,12 @@
           <w:color w:val="059669"/>
           <w:sz w:val="30"/>
         </w:rPr>
-        <w:t>2. Automatic GitHub Research Memories Gallery</w:t>
+        <w:t>2. How to Add New Academic Achievements</w:t>
       </w:r>
     </w:p>
     <w:p>
       <w:r>
-        <w:t>You asked for a folder in your GitHub account where you can drop research photos and have them automatically appear on the website under a dedicated 'Gallery' tab. This feature is now fully implemented and connected!</w:t>
-      </w:r>
-    </w:p>
-    <w:p>
-      <w:pPr>
-        <w:keepNext/>
-        <w:spacing w:before="240" w:after="80"/>
-      </w:pPr>
-      <w:r>
-        <w:rPr>
-          <w:b/>
-          <w:color w:val="0F172A"/>
-          <w:sz w:val="25"/>
-        </w:rPr>
-        <w:t>A. How to Upload Photos via GitHub Web (Zero Coding Needed!)</w:t>
-      </w:r>
-    </w:p>
-    <w:p>
-      <w:r>
-        <w:t>You can upload photos from your smartphone, camera, or laptop directly through the GitHub website without touching any code:</w:t>
-      </w:r>
-    </w:p>
-    <w:p>
-      <w:pPr>
-        <w:pStyle w:val="ListNumber"/>
-      </w:pPr>
-      <w:r>
-        <w:rPr>
-          <w:b/>
-        </w:rPr>
-        <w:t xml:space="preserve">Step 1: Open GitHub Gallery Folder: </w:t>
-      </w:r>
-      <w:r>
-        <w:t>Go to your repository gallery page:</w:t>
-        <w:br/>
-        <w:t>https://github.com/punitsharma16042003/Myportfolio/tree/main/gallery</w:t>
-      </w:r>
-    </w:p>
-    <w:p>
-      <w:pPr>
-        <w:pStyle w:val="ListNumber"/>
-      </w:pPr>
-      <w:r>
-        <w:rPr>
-          <w:b/>
-        </w:rPr>
-        <w:t xml:space="preserve">Step 2: Click 'Add file' &gt; 'Upload files': </w:t>
-      </w:r>
-      <w:r>
-        <w:t>In the top-right corner of the file list, click the 'Add file' dropdown and choose 'Upload files'.</w:t>
-      </w:r>
-    </w:p>
-    <w:p>
-      <w:pPr>
-        <w:pStyle w:val="ListNumber"/>
-      </w:pPr>
-      <w:r>
-        <w:rPr>
-          <w:b/>
-        </w:rPr>
-        <w:t xml:space="preserve">Step 3: Drag &amp; Drop Your Photos: </w:t>
-      </w:r>
-      <w:r>
-        <w:t>Drag and drop your photos into the upload box. Supported formats include .jpg, .jpeg, .png, .webp, .svg, and .gif.</w:t>
-      </w:r>
-    </w:p>
-    <w:p>
-      <w:pPr>
-        <w:pStyle w:val="ListNumber"/>
-      </w:pPr>
-      <w:r>
-        <w:rPr>
-          <w:b/>
-        </w:rPr>
-        <w:t xml:space="preserve">Step 4: Commit Changes: </w:t>
-      </w:r>
-      <w:r>
-        <w:t>Scroll down to the bottom of the page and click the green 'Commit changes' button.</w:t>
-      </w:r>
-    </w:p>
-    <w:p>
-      <w:pPr>
-        <w:keepNext/>
-        <w:spacing w:before="240" w:after="80"/>
-      </w:pPr>
-      <w:r>
-        <w:rPr>
-          <w:b/>
-          <w:color w:val="0F172A"/>
-          <w:sz w:val="25"/>
-        </w:rPr>
-        <w:t>B. Automatic Clean Title Formatting</w:t>
-      </w:r>
-    </w:p>
-    <w:p>
-      <w:r>
-        <w:t>When you upload an image, the website's intelligent loader automatically parses the filename into a clean, capitalized title:</w:t>
-      </w:r>
-    </w:p>
-    <w:p>
-      <w:pPr>
-        <w:pStyle w:val="ListBullet"/>
-      </w:pPr>
-      <w:r>
-        <w:rPr>
-          <w:rFonts w:ascii="Consolas" w:hAnsi="Consolas"/>
-        </w:rPr>
-        <w:t xml:space="preserve">satluj-water-sampling-2024.jpg → </w:t>
-      </w:r>
-      <w:r>
-        <w:rPr>
-          <w:b/>
-        </w:rPr>
-        <w:t>Satluj Water Sampling 2024</w:t>
-      </w:r>
-    </w:p>
-    <w:p>
-      <w:pPr>
-        <w:pStyle w:val="ListBullet"/>
-      </w:pPr>
-      <w:r>
-        <w:rPr>
-          <w:rFonts w:ascii="Consolas" w:hAnsi="Consolas"/>
-        </w:rPr>
-        <w:t xml:space="preserve">cqd-green-photoluminescence.png → </w:t>
-      </w:r>
-      <w:r>
-        <w:rPr>
-          <w:b/>
-        </w:rPr>
-        <w:t>Cqd Green Photoluminescence</w:t>
-      </w:r>
-    </w:p>
-    <w:p>
-      <w:pPr>
-        <w:keepNext/>
-        <w:spacing w:before="240" w:after="80"/>
-      </w:pPr>
-      <w:r>
-        <w:rPr>
-          <w:b/>
-          <w:color w:val="0F172A"/>
-          <w:sz w:val="25"/>
-        </w:rPr>
-        <w:t>C. Optional: Adding Custom Descriptions, Dates &amp; Categories</w:t>
-      </w:r>
-    </w:p>
-    <w:p>
-      <w:r>
-        <w:t>If you want to provide a rich academic description, specific date, location, or filter category ('Wet Lab', 'Fieldwork', 'Instrumentation', 'Conferences'), open portfolio-data.js, locate gallery: [ and paste:</w:t>
-      </w:r>
-    </w:p>
-    <w:tbl>
-      <w:tblPr>
-        <w:tblW w:type="auto" w:w="0"/>
-        <w:jc w:val="center"/>
-        <w:tblLook w:firstColumn="1" w:firstRow="1" w:lastColumn="0" w:lastRow="0" w:noHBand="0" w:noVBand="1" w:val="04A0"/>
-      </w:tblPr>
-      <w:tblGrid>
-        <w:gridCol w:w="9936"/>
-      </w:tblGrid>
-      <w:tr>
-        <w:tc>
-          <w:tcPr>
-            <w:tcW w:type="dxa" w:w="9792"/>
-            <w:shd w:fill="F8FAFC"/>
-            <w:tcBorders>
-              <w:left w:val="single" w:sz="12" w:space="0" w:color="CBD5E1"/>
-              <w:top w:val="single" w:sz="6" w:space="0" w:color="E2E8F0"/>
-              <w:right w:val="single" w:sz="6" w:space="0" w:color="E2E8F0"/>
-              <w:bottom w:val="single" w:sz="6" w:space="0" w:color="E2E8F0"/>
-            </w:tcBorders>
-          </w:tcPr>
-          <w:p>
-            <w:pPr>
-              <w:spacing w:before="80" w:after="80"/>
-            </w:pPr>
-            <w:r>
-              <w:rPr>
-                <w:rFonts w:ascii="Consolas" w:hAnsi="Consolas"/>
-                <w:color w:val="0F172A"/>
-                <w:sz w:val="19"/>
-              </w:rPr>
-              <w:t>{</w:t>
-              <w:br/>
-              <w:t xml:space="preserve">  id: "mem-satluj-sampling",</w:t>
-              <w:br/>
-              <w:t xml:space="preserve">  image: "gallery/satluj-sampling-run.jpg",</w:t>
-              <w:br/>
-              <w:t xml:space="preserve">  title: "Fieldwork Water Sampling along Satluj River",</w:t>
-              <w:br/>
-              <w:t xml:space="preserve">  caption: "In-situ monitoring of DO, pH, and electrical conductivity followed by heavy metals grab sampling.",</w:t>
-              <w:br/>
-              <w:t xml:space="preserve">  category: "Fieldwork",</w:t>
-              <w:br/>
-              <w:t xml:space="preserve">  date: "October 2024",</w:t>
-              <w:br/>
-              <w:t xml:space="preserve">  location: "Satluj River Basin, Punjab"</w:t>
-              <w:br/>
-              <w:t>},</w:t>
-            </w:r>
-          </w:p>
-        </w:tc>
-      </w:tr>
-    </w:tbl>
-    <w:p>
-      <w:pPr>
-        <w:spacing w:after="80"/>
-      </w:pPr>
-    </w:p>
-    <w:p>
-      <w:pPr>
-        <w:keepNext/>
-        <w:spacing w:before="320" w:after="120"/>
-      </w:pPr>
-      <w:r>
-        <w:rPr>
-          <w:b/>
-          <w:color w:val="059669"/>
-          <w:sz w:val="30"/>
-        </w:rPr>
-        <w:t>3. How to Add New Academic Achievements</w:t>
-      </w:r>
-    </w:p>
-    <w:p>
-      <w:r>
-        <w:t>To add new items to any section, open portfolio-data.js and paste the corresponding template at the top of the matching list.</w:t>
+        <w:t>To add new items to any section, open portfolio-data.js in any text editor (VS Code, Notepad) and paste the matching template at the top of that list.</w:t>
       </w:r>
     </w:p>
     <w:p>
@@ -479,7 +225,7 @@
           <w:color w:val="0F172A"/>
           <w:sz w:val="25"/>
         </w:rPr>
-        <w:t>B. Add a New Certification or Training</w:t>
+        <w:t>B. Add a New Certification or Specialized Training</w:t>
       </w:r>
     </w:p>
     <w:p>
@@ -631,6 +377,176 @@
     <w:p>
       <w:pPr>
         <w:keepNext/>
+        <w:spacing w:before="240" w:after="80"/>
+      </w:pPr>
+      <w:r>
+        <w:rPr>
+          <w:b/>
+          <w:color w:val="0F172A"/>
+          <w:sz w:val="25"/>
+        </w:rPr>
+        <w:t>D. Add a New Experimental Research Project</w:t>
+      </w:r>
+    </w:p>
+    <w:p>
+      <w:r>
+        <w:t>Locate projects: [ and paste:</w:t>
+      </w:r>
+    </w:p>
+    <w:tbl>
+      <w:tblPr>
+        <w:tblW w:type="auto" w:w="0"/>
+        <w:jc w:val="center"/>
+        <w:tblLook w:firstColumn="1" w:firstRow="1" w:lastColumn="0" w:lastRow="0" w:noHBand="0" w:noVBand="1" w:val="04A0"/>
+      </w:tblPr>
+      <w:tblGrid>
+        <w:gridCol w:w="9936"/>
+      </w:tblGrid>
+      <w:tr>
+        <w:tc>
+          <w:tcPr>
+            <w:tcW w:type="dxa" w:w="9792"/>
+            <w:shd w:fill="F8FAFC"/>
+            <w:tcBorders>
+              <w:left w:val="single" w:sz="12" w:space="0" w:color="CBD5E1"/>
+              <w:top w:val="single" w:sz="6" w:space="0" w:color="E2E8F0"/>
+              <w:right w:val="single" w:sz="6" w:space="0" w:color="E2E8F0"/>
+              <w:bottom w:val="single" w:sz="6" w:space="0" w:color="E2E8F0"/>
+            </w:tcBorders>
+          </w:tcPr>
+          <w:p>
+            <w:pPr>
+              <w:spacing w:before="80" w:after="80"/>
+            </w:pPr>
+            <w:r>
+              <w:rPr>
+                <w:rFonts w:ascii="Consolas" w:hAnsi="Consolas"/>
+                <w:color w:val="0F172A"/>
+                <w:sz w:val="19"/>
+              </w:rPr>
+              <w:t>{</w:t>
+              <w:br/>
+              <w:t xml:space="preserve">  id: "lab-proj-new",</w:t>
+              <w:br/>
+              <w:t xml:space="preserve">  title: "Nanostructured Photocatalysts for Environmental Remediation",</w:t>
+              <w:br/>
+              <w:t xml:space="preserve">  institution: "Indian Institute of Technology (IIT), Ropar",</w:t>
+              <w:br/>
+              <w:t xml:space="preserve">  period: "2026 – Present",</w:t>
+              <w:br/>
+              <w:t xml:space="preserve">  category: "Nanotechnology",</w:t>
+              <w:br/>
+              <w:t xml:space="preserve">  description: "Investigation of novel catalytic pathways utilizing biomass-derived carbon dots.",</w:t>
+              <w:br/>
+              <w:t xml:space="preserve">  highlights: [</w:t>
+              <w:br/>
+              <w:t xml:space="preserve">    "Synthesized carbon nanomaterials with high quantum yield.",</w:t>
+              <w:br/>
+              <w:t xml:space="preserve">    "Validated degradation kinetics using spectrophotometry."</w:t>
+              <w:br/>
+              <w:t xml:space="preserve">  ],</w:t>
+              <w:br/>
+              <w:t xml:space="preserve">  tags: ["CQDs", "Water Treatment", "IIT Ropar"],</w:t>
+              <w:br/>
+              <w:t xml:space="preserve">  link: null</w:t>
+              <w:br/>
+              <w:t>},</w:t>
+            </w:r>
+          </w:p>
+        </w:tc>
+      </w:tr>
+    </w:tbl>
+    <w:p>
+      <w:pPr>
+        <w:spacing w:after="80"/>
+      </w:pPr>
+    </w:p>
+    <w:p>
+      <w:pPr>
+        <w:keepNext/>
+        <w:spacing w:before="240" w:after="80"/>
+      </w:pPr>
+      <w:r>
+        <w:rPr>
+          <w:b/>
+          <w:color w:val="0F172A"/>
+          <w:sz w:val="25"/>
+        </w:rPr>
+        <w:t>E. Add a New Work / Research Experience Position</w:t>
+      </w:r>
+    </w:p>
+    <w:p>
+      <w:r>
+        <w:t>Locate experience: [ and paste:</w:t>
+      </w:r>
+    </w:p>
+    <w:tbl>
+      <w:tblPr>
+        <w:tblW w:type="auto" w:w="0"/>
+        <w:jc w:val="center"/>
+        <w:tblLook w:firstColumn="1" w:firstRow="1" w:lastColumn="0" w:lastRow="0" w:noHBand="0" w:noVBand="1" w:val="04A0"/>
+      </w:tblPr>
+      <w:tblGrid>
+        <w:gridCol w:w="9936"/>
+      </w:tblGrid>
+      <w:tr>
+        <w:tc>
+          <w:tcPr>
+            <w:tcW w:type="dxa" w:w="9792"/>
+            <w:shd w:fill="F8FAFC"/>
+            <w:tcBorders>
+              <w:left w:val="single" w:sz="12" w:space="0" w:color="CBD5E1"/>
+              <w:top w:val="single" w:sz="6" w:space="0" w:color="E2E8F0"/>
+              <w:right w:val="single" w:sz="6" w:space="0" w:color="E2E8F0"/>
+              <w:bottom w:val="single" w:sz="6" w:space="0" w:color="E2E8F0"/>
+            </w:tcBorders>
+          </w:tcPr>
+          <w:p>
+            <w:pPr>
+              <w:spacing w:before="80" w:after="80"/>
+            </w:pPr>
+            <w:r>
+              <w:rPr>
+                <w:rFonts w:ascii="Consolas" w:hAnsi="Consolas"/>
+                <w:color w:val="0F172A"/>
+                <w:sz w:val="19"/>
+              </w:rPr>
+              <w:t>{</w:t>
+              <w:br/>
+              <w:t xml:space="preserve">  id: "exp-new",</w:t>
+              <w:br/>
+              <w:t xml:space="preserve">  role: "Senior Research Associate",</w:t>
+              <w:br/>
+              <w:t xml:space="preserve">  organization: "IIT Ropar",</w:t>
+              <w:br/>
+              <w:t xml:space="preserve">  location: "Rupnagar, Punjab, India",</w:t>
+              <w:br/>
+              <w:t xml:space="preserve">  period: "2026 – Present",</w:t>
+              <w:br/>
+              <w:t xml:space="preserve">  type: "Research &amp; Development",</w:t>
+              <w:br/>
+              <w:t xml:space="preserve">  bullets: [</w:t>
+              <w:br/>
+              <w:t xml:space="preserve">    "Directing analytical characterization workflows on ICP-MS and AAS.",</w:t>
+              <w:br/>
+              <w:t xml:space="preserve">    "Authoring technical research manuscripts and environmental audit reports."</w:t>
+              <w:br/>
+              <w:t xml:space="preserve">  ]</w:t>
+              <w:br/>
+              <w:t>},</w:t>
+            </w:r>
+          </w:p>
+        </w:tc>
+      </w:tr>
+    </w:tbl>
+    <w:p>
+      <w:pPr>
+        <w:spacing w:after="80"/>
+      </w:pPr>
+    </w:p>
+    <w:p>
+      <w:pPr>
+        <w:keepNext/>
         <w:spacing w:before="320" w:after="120"/>
       </w:pPr>
       <w:r>
@@ -639,12 +555,12 @@
           <w:color w:val="059669"/>
           <w:sz w:val="30"/>
         </w:rPr>
-        <w:t>4. How to Remove Any Entry</w:t>
+        <w:t>3. How to Remove Any Entry</w:t>
       </w:r>
     </w:p>
     <w:p>
       <w:r>
-        <w:t>Removing an entry takes just 3 simple steps:</w:t>
+        <w:t>Removing an entry is fast and easy:</w:t>
       </w:r>
     </w:p>
     <w:p>
@@ -652,7 +568,7 @@
         <w:pStyle w:val="ListNumber"/>
       </w:pPr>
       <w:r>
-        <w:t>Open portfolio-data.js in any text editor (Notepad, VS Code).</w:t>
+        <w:t>Open portfolio-data.js in your text editor.</w:t>
       </w:r>
     </w:p>
     <w:p>
@@ -660,7 +576,7 @@
         <w:pStyle w:val="ListNumber"/>
       </w:pPr>
       <w:r>
-        <w:t>Press Ctrl + F and search for the title or name of the entry you want to delete.</w:t>
+        <w:t>Press Ctrl + F to search for the title of the entry you want to delete.</w:t>
       </w:r>
     </w:p>
     <w:p>
@@ -668,7 +584,7 @@
         <w:pStyle w:val="ListNumber"/>
       </w:pPr>
       <w:r>
-        <w:t>Select the entire block between { and }, (including the trailing comma) and delete it. Save the file!</w:t>
+        <w:t>Select the entire entry block between { and }, (including the trailing comma) and delete it. Save the file!</w:t>
       </w:r>
     </w:p>
     <w:p>
@@ -682,12 +598,55 @@
           <w:color w:val="059669"/>
           <w:sz w:val="30"/>
         </w:rPr>
-        <w:t>5. Publishing Changes to GitHub Pages</w:t>
+        <w:t>4. Updating Your Profile Info, CV &amp; Photo</w:t>
       </w:r>
     </w:p>
     <w:p>
       <w:r>
-        <w:t>Whenever you make edits locally on your computer, push them live with these 3 standard Git commands:</w:t>
+        <w:t>To update basic details:</w:t>
+      </w:r>
+    </w:p>
+    <w:p>
+      <w:pPr>
+        <w:pStyle w:val="ListBullet"/>
+      </w:pPr>
+      <w:r>
+        <w:t>Profile Picture: Replace profile.jpg in your repository with your new picture (keep the filename profile.jpg).</w:t>
+      </w:r>
+    </w:p>
+    <w:p>
+      <w:pPr>
+        <w:pStyle w:val="ListBullet"/>
+      </w:pPr>
+      <w:r>
+        <w:t>Resume / CV: Replace resume.pdf in your repository with your updated CV (keep the filename resume.pdf).</w:t>
+      </w:r>
+    </w:p>
+    <w:p>
+      <w:pPr>
+        <w:pStyle w:val="ListBullet"/>
+      </w:pPr>
+      <w:r>
+        <w:t>Bio &amp; Contact: Edit personalInfo in portfolio-data.js (email, phone, LinkedIn, Google Scholar).</w:t>
+      </w:r>
+    </w:p>
+    <w:p>
+      <w:pPr>
+        <w:keepNext/>
+        <w:spacing w:before="320" w:after="120"/>
+      </w:pPr>
+      <w:r>
+        <w:rPr>
+          <w:b/>
+          <w:color w:val="059669"/>
+          <w:sz w:val="30"/>
+        </w:rPr>
+        <w:t>5. Publishing Updates to GitHub Pages</w:t>
+      </w:r>
+    </w:p>
+    <w:p>
+      <w:r>
+        <w:t>Whenever you save changes on your PC, push them live with these 3 simple commands:</w:t>
       </w:r>
     </w:p>
     <w:tbl>
@@ -723,7 +682,7 @@
               </w:rPr>
               <w:t>git add .</w:t>
               <w:br/>
-              <w:t>git commit -m "Update portfolio: added new photo and training certificate"</w:t>
+              <w:t>git commit -m "Update portfolio: added new publication"</w:t>
               <w:br/>
               <w:t>git push origin main</w:t>
             </w:r>
@@ -738,7 +697,7 @@
     </w:p>
     <w:p>
       <w:r>
-        <w:t>Within 60 to 90 seconds, GitHub Pages will automatically refresh and your website will be live worldwide!</w:t>
+        <w:t>Within 60 seconds, GitHub Pages will automatically update your live site!</w:t>
       </w:r>
     </w:p>
     <w:sectPr>

</xml_diff>